<commit_message>
docs(manuscript): finalize V2 definitive manuscript suite with peer-reviewed biophysics and limitations note
</commit_message>
<xml_diff>
--- a/manuscript/09_MANOSCRITTO_FORMATO_WORD.docx
+++ b/manuscript/09_MANOSCRITTO_FORMATO_WORD.docx
@@ -18727,7 +18727,74 @@
         <w:pStyle w:val="FirstParagraph"/>
       </w:pPr>
       <w:r>
-        <w:t xml:space="preserve">All transport parameters are assumed from biophysical measurements in neoplastic tissue. The model idealizes microvasculature as isolated cylinders without inter-vessel field overlap or convection. The MSKCC cohort is retrospective, surgical, lacks osimertinib exposure, provides only predominant subtype, and does not record adjuvant systemic chemotherapy.</w:t>
+        <w:t xml:space="preserve">All transport parameters are assumed from biophysical measurements in neoplastic tissue. The model idealizes microvasculature as isolated cylinders without inter-vessel field overlap or convection. Additionally, while plasma protein binding is parameterized at a standard baseline of ~95% (</w:t>
+      </w:r>
+      <m:oMath>
+        <m:sSub>
+          <m:e>
+            <m:r>
+              <m:t>C</m:t>
+            </m:r>
+          </m:e>
+          <m:sub>
+            <m:r>
+              <m:t>0</m:t>
+            </m:r>
+          </m:sub>
+        </m:sSub>
+        <m:r>
+          <m:rPr>
+            <m:sty m:val="p"/>
+          </m:rPr>
+          <m:t>≈</m:t>
+        </m:r>
+        <m:r>
+          <m:t>40</m:t>
+        </m:r>
+        <m:r>
+          <m:t> </m:t>
+        </m:r>
+        <m:r>
+          <m:rPr>
+            <m:nor/>
+            <m:sty m:val="p"/>
+          </m:rPr>
+          <m:t>nM</m:t>
+        </m:r>
+      </m:oMath>
+      <w:r>
+        <w:t xml:space="preserve">), physiological inter-patient pharmacokinetic variability and albumin fluctuations can dynamically modulate the free fraction, shifting the threshold</w:t>
+      </w:r>
+      <w:r>
+        <w:t xml:space="preserve"> </w:t>
+      </w:r>
+      <m:oMath>
+        <m:r>
+          <m:t>θ</m:t>
+        </m:r>
+      </m:oMath>
+      <w:r>
+        <w:t xml:space="preserve"> </w:t>
+      </w:r>
+      <w:r>
+        <w:t xml:space="preserve">and either expanding or compressing the viable sanctuary shell width</w:t>
+      </w:r>
+      <w:r>
+        <w:t xml:space="preserve"> </w:t>
+      </w:r>
+      <m:oMath>
+        <m:r>
+          <m:t>Δ</m:t>
+        </m:r>
+        <m:r>
+          <m:t>r</m:t>
+        </m:r>
+      </m:oMath>
+      <w:r>
+        <w:t xml:space="preserve"> </w:t>
+      </w:r>
+      <w:r>
+        <w:t xml:space="preserve">as quantified in our parametric sensitivity analysis. The MSKCC cohort is retrospective, surgical, lacks osimertinib exposure, provides only predominant subtype, and does not record adjuvant systemic chemotherapy.</w:t>
       </w:r>
     </w:p>
     <w:p>

</xml_diff>